<commit_message>
docs: atualiza manuais e prints do manual
</commit_message>
<xml_diff>
--- a/documentacao/manuais/MANUAL_CANDIDATO.docx
+++ b/documentacao/manuais/MANUAL_CANDIDATO.docx
@@ -2,32 +2,6 @@
 <file path=word/document.xml><?xml version="1.0" encoding="utf-8"?>
 <w:document xmlns:wpc="http://schemas.microsoft.com/office/word/2010/wordprocessingCanvas" xmlns:cx="http://schemas.microsoft.com/office/drawing/2014/chartex" xmlns:cx1="http://schemas.microsoft.com/office/drawing/2015/9/8/chartex" xmlns:cx2="http://schemas.microsoft.com/office/drawing/2015/10/21/chartex" xmlns:cx3="http://schemas.microsoft.com/office/drawing/2016/5/9/chartex" xmlns:cx4="http://schemas.microsoft.com/office/drawing/2016/5/10/chartex" xmlns:cx5="http://schemas.microsoft.com/office/drawing/2016/5/11/chartex" xmlns:cx6="http://schemas.microsoft.com/office/drawing/2016/5/12/chartex" xmlns:cx7="http://schemas.microsoft.com/office/drawing/2016/5/13/chartex" xmlns:cx8="http://schemas.microsoft.com/office/drawing/2016/5/14/chartex" xmlns:mc="http://schemas.openxmlformats.org/markup-compatibility/2006" xmlns:aink="http://schemas.microsoft.com/office/drawing/2016/ink" xmlns:am3d="http://schemas.microsoft.com/office/drawing/2017/model3d" xmlns:o="urn:schemas-microsoft-com:office:office" xmlns:oel="http://schemas.microsoft.com/office/2019/extlst" xmlns:r="http://schemas.openxmlformats.org/officeDocument/2006/relationships" xmlns:m="http://schemas.openxmlformats.org/officeDocument/2006/math" xmlns:v="urn:schemas-microsoft-com:vml" xmlns:wp14="http://schemas.microsoft.com/office/word/2010/wordprocessingDrawing" xmlns:wp="http://schemas.openxmlformats.org/drawingml/2006/wordprocessingDrawing" xmlns:w10="urn:schemas-microsoft-com:office:word" xmlns:w="http://schemas.openxmlformats.org/wordprocessingml/2006/main" xmlns:w14="http://schemas.microsoft.com/office/word/2010/wordml" xmlns:w15="http://schemas.microsoft.com/office/word/2012/wordml" xmlns:w16cex="http://schemas.microsoft.com/office/word/2018/wordml/cex" xmlns:w16cid="http://schemas.microsoft.com/office/word/2016/wordml/cid" xmlns:w16="http://schemas.microsoft.com/office/word/2018/wordml" xmlns:w16du="http://schemas.microsoft.com/office/word/2023/wordml/word16du" xmlns:w16sdtdh="http://schemas.microsoft.com/office/word/2020/wordml/sdtdatahash" xmlns:w16sdtfl="http://schemas.microsoft.com/office/word/2024/wordml/sdtformatlock" xmlns:w16se="http://schemas.microsoft.com/office/word/2015/wordml/symex" xmlns:wpg="http://schemas.microsoft.com/office/word/2010/wordprocessingGroup" xmlns:wpi="http://schemas.microsoft.com/office/word/2010/wordprocessingInk" xmlns:wne="http://schemas.microsoft.com/office/word/2006/wordml" xmlns:wps="http://schemas.microsoft.com/office/word/2010/wordprocessingShape" mc:Ignorable="w14 w15 w16se w16cid w16 w16cex w16sdtdh w16sdtfl w16du wp14">
   <w:body>
-    <w:p>
-      <w:pPr>
-        <w:pStyle w:val="Ttulo"/>
-        <w:rPr>
-          <w:szCs w:val="24"/>
-        </w:rPr>
-      </w:pPr>
-      <w:bookmarkStart w:id="0" w:name="_Toc216769626"/>
-      <w:r>
-        <w:rPr>
-          <w:szCs w:val="24"/>
-        </w:rPr>
-        <w:t>Manual do Candidato — Sistema PLANTERR</w:t>
-      </w:r>
-      <w:bookmarkEnd w:id="0"/>
-    </w:p>
-    <w:p>
-      <w:pPr>
-        <w:pStyle w:val="Subttulo"/>
-      </w:pPr>
-      <w:bookmarkStart w:id="1" w:name="_Toc216769627"/>
-      <w:r>
-        <w:t>Inscrição, envio e geração do PDF</w:t>
-      </w:r>
-      <w:bookmarkEnd w:id="1"/>
-    </w:p>
     <w:p>
       <w:pPr>
         <w:pStyle w:val="CabealhodoSumrio"/>
@@ -39,6 +13,71 @@
           <w:szCs w:val="24"/>
         </w:rPr>
       </w:pPr>
+      <w:r>
+        <w:rPr>
+          <w:rFonts w:eastAsiaTheme="minorEastAsia" w:cs="Times New Roman"/>
+          <w:b w:val="0"/>
+          <w:bCs w:val="0"/>
+          <w:noProof/>
+          <w:kern w:val="0"/>
+          <w:szCs w:val="24"/>
+        </w:rPr>
+        <w:drawing>
+          <wp:anchor distT="0" distB="0" distL="114300" distR="114300" simplePos="0" relativeHeight="251658240" behindDoc="0" locked="0" layoutInCell="1" allowOverlap="1" wp14:anchorId="7BD6F3DB" wp14:editId="1F23ED2E">
+            <wp:simplePos x="0" y="0"/>
+            <wp:positionH relativeFrom="column">
+              <wp:posOffset>-1461135</wp:posOffset>
+            </wp:positionH>
+            <wp:positionV relativeFrom="paragraph">
+              <wp:posOffset>-950315</wp:posOffset>
+            </wp:positionV>
+            <wp:extent cx="8132274" cy="10523180"/>
+            <wp:effectExtent l="0" t="0" r="2540" b="0"/>
+            <wp:wrapNone/>
+            <wp:docPr id="1315270392" name="Imagem 1"/>
+            <wp:cNvGraphicFramePr>
+              <a:graphicFrameLocks xmlns:a="http://schemas.openxmlformats.org/drawingml/2006/main" noChangeAspect="1"/>
+            </wp:cNvGraphicFramePr>
+            <a:graphic xmlns:a="http://schemas.openxmlformats.org/drawingml/2006/main">
+              <a:graphicData uri="http://schemas.openxmlformats.org/drawingml/2006/picture">
+                <pic:pic xmlns:pic="http://schemas.openxmlformats.org/drawingml/2006/picture">
+                  <pic:nvPicPr>
+                    <pic:cNvPr id="1315270392" name="Imagem 1"/>
+                    <pic:cNvPicPr/>
+                  </pic:nvPicPr>
+                  <pic:blipFill>
+                    <a:blip r:embed="rId7" cstate="print">
+                      <a:extLst>
+                        <a:ext uri="{28A0092B-C50C-407E-A947-70E740481C1C}">
+                          <a14:useLocalDpi xmlns:a14="http://schemas.microsoft.com/office/drawing/2010/main" val="0"/>
+                        </a:ext>
+                      </a:extLst>
+                    </a:blip>
+                    <a:stretch>
+                      <a:fillRect/>
+                    </a:stretch>
+                  </pic:blipFill>
+                  <pic:spPr>
+                    <a:xfrm>
+                      <a:off x="0" y="0"/>
+                      <a:ext cx="8132274" cy="10523180"/>
+                    </a:xfrm>
+                    <a:prstGeom prst="rect">
+                      <a:avLst/>
+                    </a:prstGeom>
+                  </pic:spPr>
+                </pic:pic>
+              </a:graphicData>
+            </a:graphic>
+            <wp14:sizeRelH relativeFrom="page">
+              <wp14:pctWidth>0</wp14:pctWidth>
+            </wp14:sizeRelH>
+            <wp14:sizeRelV relativeFrom="page">
+              <wp14:pctHeight>0</wp14:pctHeight>
+            </wp14:sizeRelV>
+          </wp:anchor>
+        </w:drawing>
+      </w:r>
     </w:p>
     <w:p>
       <w:pPr>
@@ -52,6 +91,320 @@
         </w:rPr>
       </w:pPr>
     </w:p>
+    <w:p>
+      <w:pPr>
+        <w:pStyle w:val="CabealhodoSumrio"/>
+        <w:rPr>
+          <w:rFonts w:eastAsiaTheme="minorEastAsia" w:cs="Times New Roman"/>
+          <w:b w:val="0"/>
+          <w:bCs w:val="0"/>
+          <w:kern w:val="0"/>
+          <w:szCs w:val="24"/>
+        </w:rPr>
+      </w:pPr>
+    </w:p>
+    <w:p>
+      <w:pPr>
+        <w:pStyle w:val="CabealhodoSumrio"/>
+        <w:rPr>
+          <w:rFonts w:eastAsiaTheme="minorEastAsia" w:cs="Times New Roman"/>
+          <w:b w:val="0"/>
+          <w:bCs w:val="0"/>
+          <w:kern w:val="0"/>
+          <w:szCs w:val="24"/>
+        </w:rPr>
+      </w:pPr>
+    </w:p>
+    <w:p>
+      <w:pPr>
+        <w:pStyle w:val="CabealhodoSumrio"/>
+        <w:rPr>
+          <w:rFonts w:eastAsiaTheme="minorEastAsia" w:cs="Times New Roman"/>
+          <w:b w:val="0"/>
+          <w:bCs w:val="0"/>
+          <w:kern w:val="0"/>
+          <w:szCs w:val="24"/>
+        </w:rPr>
+      </w:pPr>
+    </w:p>
+    <w:p>
+      <w:pPr>
+        <w:pStyle w:val="CabealhodoSumrio"/>
+        <w:rPr>
+          <w:rFonts w:eastAsiaTheme="minorEastAsia" w:cs="Times New Roman"/>
+          <w:b w:val="0"/>
+          <w:bCs w:val="0"/>
+          <w:kern w:val="0"/>
+          <w:szCs w:val="24"/>
+        </w:rPr>
+      </w:pPr>
+    </w:p>
+    <w:p>
+      <w:pPr>
+        <w:pStyle w:val="CabealhodoSumrio"/>
+        <w:rPr>
+          <w:rFonts w:eastAsiaTheme="minorEastAsia" w:cs="Times New Roman"/>
+          <w:b w:val="0"/>
+          <w:bCs w:val="0"/>
+          <w:kern w:val="0"/>
+          <w:szCs w:val="24"/>
+        </w:rPr>
+      </w:pPr>
+    </w:p>
+    <w:p>
+      <w:pPr>
+        <w:pStyle w:val="CabealhodoSumrio"/>
+        <w:rPr>
+          <w:rFonts w:eastAsiaTheme="minorEastAsia" w:cs="Times New Roman"/>
+          <w:b w:val="0"/>
+          <w:bCs w:val="0"/>
+          <w:kern w:val="0"/>
+          <w:szCs w:val="24"/>
+        </w:rPr>
+      </w:pPr>
+    </w:p>
+    <w:p>
+      <w:pPr>
+        <w:pStyle w:val="CabealhodoSumrio"/>
+        <w:rPr>
+          <w:rFonts w:eastAsiaTheme="minorEastAsia" w:cs="Times New Roman"/>
+          <w:b w:val="0"/>
+          <w:bCs w:val="0"/>
+          <w:kern w:val="0"/>
+          <w:szCs w:val="24"/>
+        </w:rPr>
+      </w:pPr>
+    </w:p>
+    <w:p>
+      <w:pPr>
+        <w:pStyle w:val="CabealhodoSumrio"/>
+        <w:rPr>
+          <w:rFonts w:eastAsiaTheme="minorEastAsia" w:cs="Times New Roman"/>
+          <w:b w:val="0"/>
+          <w:bCs w:val="0"/>
+          <w:kern w:val="0"/>
+          <w:szCs w:val="24"/>
+        </w:rPr>
+      </w:pPr>
+    </w:p>
+    <w:p>
+      <w:pPr>
+        <w:pStyle w:val="CabealhodoSumrio"/>
+        <w:rPr>
+          <w:rFonts w:eastAsiaTheme="minorEastAsia" w:cs="Times New Roman"/>
+          <w:b w:val="0"/>
+          <w:bCs w:val="0"/>
+          <w:kern w:val="0"/>
+          <w:szCs w:val="24"/>
+        </w:rPr>
+      </w:pPr>
+    </w:p>
+    <w:p>
+      <w:pPr>
+        <w:pStyle w:val="CabealhodoSumrio"/>
+        <w:rPr>
+          <w:rFonts w:eastAsiaTheme="minorEastAsia" w:cs="Times New Roman"/>
+          <w:b w:val="0"/>
+          <w:bCs w:val="0"/>
+          <w:kern w:val="0"/>
+          <w:szCs w:val="24"/>
+        </w:rPr>
+      </w:pPr>
+    </w:p>
+    <w:p>
+      <w:pPr>
+        <w:pStyle w:val="CabealhodoSumrio"/>
+        <w:rPr>
+          <w:rFonts w:eastAsiaTheme="minorEastAsia" w:cs="Times New Roman"/>
+          <w:b w:val="0"/>
+          <w:bCs w:val="0"/>
+          <w:kern w:val="0"/>
+          <w:szCs w:val="24"/>
+        </w:rPr>
+      </w:pPr>
+    </w:p>
+    <w:p>
+      <w:pPr>
+        <w:pStyle w:val="CabealhodoSumrio"/>
+        <w:rPr>
+          <w:rFonts w:eastAsiaTheme="minorEastAsia" w:cs="Times New Roman"/>
+          <w:b w:val="0"/>
+          <w:bCs w:val="0"/>
+          <w:kern w:val="0"/>
+          <w:szCs w:val="24"/>
+        </w:rPr>
+      </w:pPr>
+    </w:p>
+    <w:p>
+      <w:pPr>
+        <w:pStyle w:val="CabealhodoSumrio"/>
+        <w:rPr>
+          <w:rFonts w:eastAsiaTheme="minorEastAsia" w:cs="Times New Roman"/>
+          <w:b w:val="0"/>
+          <w:bCs w:val="0"/>
+          <w:kern w:val="0"/>
+          <w:szCs w:val="24"/>
+        </w:rPr>
+      </w:pPr>
+    </w:p>
+    <w:p>
+      <w:pPr>
+        <w:pStyle w:val="CabealhodoSumrio"/>
+        <w:rPr>
+          <w:rFonts w:eastAsiaTheme="minorEastAsia" w:cs="Times New Roman"/>
+          <w:b w:val="0"/>
+          <w:bCs w:val="0"/>
+          <w:kern w:val="0"/>
+          <w:szCs w:val="24"/>
+        </w:rPr>
+      </w:pPr>
+    </w:p>
+    <w:p>
+      <w:pPr>
+        <w:pStyle w:val="CabealhodoSumrio"/>
+        <w:rPr>
+          <w:rFonts w:eastAsiaTheme="minorEastAsia" w:cs="Times New Roman"/>
+          <w:b w:val="0"/>
+          <w:bCs w:val="0"/>
+          <w:kern w:val="0"/>
+          <w:szCs w:val="24"/>
+        </w:rPr>
+      </w:pPr>
+    </w:p>
+    <w:p>
+      <w:pPr>
+        <w:pStyle w:val="CabealhodoSumrio"/>
+        <w:rPr>
+          <w:rFonts w:eastAsiaTheme="minorEastAsia" w:cs="Times New Roman"/>
+          <w:b w:val="0"/>
+          <w:bCs w:val="0"/>
+          <w:kern w:val="0"/>
+          <w:szCs w:val="24"/>
+        </w:rPr>
+      </w:pPr>
+    </w:p>
+    <w:p>
+      <w:pPr>
+        <w:pStyle w:val="CabealhodoSumrio"/>
+        <w:rPr>
+          <w:rFonts w:eastAsiaTheme="minorEastAsia" w:cs="Times New Roman"/>
+          <w:b w:val="0"/>
+          <w:bCs w:val="0"/>
+          <w:kern w:val="0"/>
+          <w:szCs w:val="24"/>
+        </w:rPr>
+      </w:pPr>
+    </w:p>
+    <w:p>
+      <w:pPr>
+        <w:pStyle w:val="CabealhodoSumrio"/>
+        <w:rPr>
+          <w:rFonts w:eastAsiaTheme="minorEastAsia" w:cs="Times New Roman"/>
+          <w:b w:val="0"/>
+          <w:bCs w:val="0"/>
+          <w:kern w:val="0"/>
+          <w:szCs w:val="24"/>
+        </w:rPr>
+      </w:pPr>
+    </w:p>
+    <w:p>
+      <w:pPr>
+        <w:pStyle w:val="CabealhodoSumrio"/>
+        <w:rPr>
+          <w:rFonts w:eastAsiaTheme="minorEastAsia" w:cs="Times New Roman"/>
+          <w:b w:val="0"/>
+          <w:bCs w:val="0"/>
+          <w:kern w:val="0"/>
+          <w:szCs w:val="24"/>
+        </w:rPr>
+      </w:pPr>
+    </w:p>
+    <w:p>
+      <w:pPr>
+        <w:pStyle w:val="CabealhodoSumrio"/>
+        <w:rPr>
+          <w:rFonts w:eastAsiaTheme="minorEastAsia" w:cs="Times New Roman"/>
+          <w:b w:val="0"/>
+          <w:bCs w:val="0"/>
+          <w:kern w:val="0"/>
+          <w:szCs w:val="24"/>
+        </w:rPr>
+      </w:pPr>
+    </w:p>
+    <w:p>
+      <w:pPr>
+        <w:pStyle w:val="CabealhodoSumrio"/>
+        <w:rPr>
+          <w:rFonts w:eastAsiaTheme="minorEastAsia" w:cs="Times New Roman"/>
+          <w:b w:val="0"/>
+          <w:bCs w:val="0"/>
+          <w:kern w:val="0"/>
+          <w:szCs w:val="24"/>
+        </w:rPr>
+      </w:pPr>
+    </w:p>
+    <w:p>
+      <w:pPr>
+        <w:pStyle w:val="CabealhodoSumrio"/>
+        <w:rPr>
+          <w:rFonts w:eastAsiaTheme="minorEastAsia" w:cs="Times New Roman"/>
+          <w:b w:val="0"/>
+          <w:bCs w:val="0"/>
+          <w:kern w:val="0"/>
+          <w:szCs w:val="24"/>
+        </w:rPr>
+      </w:pPr>
+    </w:p>
+    <w:p>
+      <w:pPr>
+        <w:pStyle w:val="CabealhodoSumrio"/>
+        <w:rPr>
+          <w:rFonts w:eastAsiaTheme="minorEastAsia" w:cs="Times New Roman"/>
+          <w:b w:val="0"/>
+          <w:bCs w:val="0"/>
+          <w:kern w:val="0"/>
+          <w:szCs w:val="24"/>
+        </w:rPr>
+      </w:pPr>
+    </w:p>
+    <w:p>
+      <w:pPr>
+        <w:pStyle w:val="CabealhodoSumrio"/>
+        <w:rPr>
+          <w:rFonts w:eastAsiaTheme="minorEastAsia" w:cs="Times New Roman"/>
+          <w:b w:val="0"/>
+          <w:bCs w:val="0"/>
+          <w:kern w:val="0"/>
+          <w:szCs w:val="24"/>
+        </w:rPr>
+      </w:pPr>
+    </w:p>
+    <w:p>
+      <w:pPr>
+        <w:pStyle w:val="CabealhodoSumrio"/>
+        <w:rPr>
+          <w:rFonts w:eastAsiaTheme="minorEastAsia" w:cs="Times New Roman"/>
+          <w:b w:val="0"/>
+          <w:bCs w:val="0"/>
+          <w:kern w:val="0"/>
+          <w:szCs w:val="24"/>
+        </w:rPr>
+      </w:pPr>
+    </w:p>
+    <w:p>
+      <w:pPr>
+        <w:pStyle w:val="CabealhodoSumrio"/>
+        <w:rPr>
+          <w:rFonts w:eastAsiaTheme="minorEastAsia" w:cs="Times New Roman"/>
+          <w:b w:val="0"/>
+          <w:bCs w:val="0"/>
+          <w:kern w:val="0"/>
+          <w:szCs w:val="24"/>
+        </w:rPr>
+      </w:pPr>
+    </w:p>
+    <w:p/>
+    <w:p/>
     <w:sdt>
       <w:sdtPr>
         <w:rPr>
@@ -61,7 +414,7 @@
           <w:kern w:val="0"/>
           <w:szCs w:val="24"/>
         </w:rPr>
-        <w:id w:val="1173065565"/>
+        <w:id w:val="-1617673312"/>
         <w:docPartObj>
           <w:docPartGallery w:val="Table of Contents"/>
           <w:docPartUnique/>
@@ -71,32 +424,10 @@
         <w:p>
           <w:pPr>
             <w:pStyle w:val="CabealhodoSumrio"/>
-            <w:rPr>
-              <w:szCs w:val="24"/>
-            </w:rPr>
           </w:pPr>
-          <w:proofErr w:type="spellStart"/>
           <w:r>
-            <w:rPr>
-              <w:szCs w:val="24"/>
-            </w:rPr>
-            <w:t>Table</w:t>
+            <w:t>Sumário</w:t>
           </w:r>
-          <w:proofErr w:type="spellEnd"/>
-          <w:r>
-            <w:rPr>
-              <w:szCs w:val="24"/>
-            </w:rPr>
-            <w:t xml:space="preserve"> of </w:t>
-          </w:r>
-          <w:proofErr w:type="spellStart"/>
-          <w:r>
-            <w:rPr>
-              <w:szCs w:val="24"/>
-            </w:rPr>
-            <w:t>Contents</w:t>
-          </w:r>
-          <w:proofErr w:type="spellEnd"/>
         </w:p>
         <w:p>
           <w:pPr>
@@ -117,7 +448,7 @@
           <w:r>
             <w:fldChar w:fldCharType="separate"/>
           </w:r>
-          <w:hyperlink w:anchor="_Toc216769626" w:history="1">
+          <w:hyperlink w:anchor="_Toc216784261" w:history="1">
             <w:r>
               <w:rPr>
                 <w:rStyle w:val="Hyperlink"/>
@@ -144,7 +475,7 @@
                 <w:noProof/>
                 <w:webHidden/>
               </w:rPr>
-              <w:instrText xml:space="preserve"> PAGEREF _Toc216769626 \h </w:instrText>
+              <w:instrText xml:space="preserve"> PAGEREF _Toc216784261 \h </w:instrText>
             </w:r>
             <w:r>
               <w:rPr>
@@ -185,7 +516,7 @@
               <w:noProof/>
             </w:rPr>
           </w:pPr>
-          <w:hyperlink w:anchor="_Toc216769627" w:history="1">
+          <w:hyperlink w:anchor="_Toc216784262" w:history="1">
             <w:r>
               <w:rPr>
                 <w:rStyle w:val="Hyperlink"/>
@@ -212,7 +543,7 @@
                 <w:noProof/>
                 <w:webHidden/>
               </w:rPr>
-              <w:instrText xml:space="preserve"> PAGEREF _Toc216769627 \h </w:instrText>
+              <w:instrText xml:space="preserve"> PAGEREF _Toc216784262 \h </w:instrText>
             </w:r>
             <w:r>
               <w:rPr>
@@ -253,13 +584,13 @@
               <w:noProof/>
             </w:rPr>
           </w:pPr>
-          <w:hyperlink w:anchor="_Toc216769628" w:history="1">
+          <w:hyperlink w:anchor="_Toc216784263" w:history="1">
             <w:r>
               <w:rPr>
                 <w:rStyle w:val="Hyperlink"/>
                 <w:noProof/>
               </w:rPr>
-              <w:t>1. Apresentação</w:t>
+              <w:t>1. APRESENTAÇÃO</w:t>
             </w:r>
             <w:r>
               <w:rPr>
@@ -280,7 +611,7 @@
                 <w:noProof/>
                 <w:webHidden/>
               </w:rPr>
-              <w:instrText xml:space="preserve"> PAGEREF _Toc216769628 \h </w:instrText>
+              <w:instrText xml:space="preserve"> PAGEREF _Toc216784263 \h </w:instrText>
             </w:r>
             <w:r>
               <w:rPr>
@@ -321,13 +652,13 @@
               <w:noProof/>
             </w:rPr>
           </w:pPr>
-          <w:hyperlink w:anchor="_Toc216769629" w:history="1">
+          <w:hyperlink w:anchor="_Toc216784264" w:history="1">
             <w:r>
               <w:rPr>
                 <w:rStyle w:val="Hyperlink"/>
                 <w:noProof/>
               </w:rPr>
-              <w:t>2. Antes de começar</w:t>
+              <w:t>2. ANTES DE COMEÇAR</w:t>
             </w:r>
             <w:r>
               <w:rPr>
@@ -348,7 +679,7 @@
                 <w:noProof/>
                 <w:webHidden/>
               </w:rPr>
-              <w:instrText xml:space="preserve"> PAGEREF _Toc216769629 \h </w:instrText>
+              <w:instrText xml:space="preserve"> PAGEREF _Toc216784264 \h </w:instrText>
             </w:r>
             <w:r>
               <w:rPr>
@@ -389,7 +720,7 @@
               <w:noProof/>
             </w:rPr>
           </w:pPr>
-          <w:hyperlink w:anchor="_Toc216769630" w:history="1">
+          <w:hyperlink w:anchor="_Toc216784265" w:history="1">
             <w:r>
               <w:rPr>
                 <w:rStyle w:val="Hyperlink"/>
@@ -416,7 +747,7 @@
                 <w:noProof/>
                 <w:webHidden/>
               </w:rPr>
-              <w:instrText xml:space="preserve"> PAGEREF _Toc216769630 \h </w:instrText>
+              <w:instrText xml:space="preserve"> PAGEREF _Toc216784265 \h </w:instrText>
             </w:r>
             <w:r>
               <w:rPr>
@@ -457,7 +788,7 @@
               <w:noProof/>
             </w:rPr>
           </w:pPr>
-          <w:hyperlink w:anchor="_Toc216769631" w:history="1">
+          <w:hyperlink w:anchor="_Toc216784266" w:history="1">
             <w:r>
               <w:rPr>
                 <w:rStyle w:val="Hyperlink"/>
@@ -484,7 +815,7 @@
                 <w:noProof/>
                 <w:webHidden/>
               </w:rPr>
-              <w:instrText xml:space="preserve"> PAGEREF _Toc216769631 \h </w:instrText>
+              <w:instrText xml:space="preserve"> PAGEREF _Toc216784266 \h </w:instrText>
             </w:r>
             <w:r>
               <w:rPr>
@@ -525,13 +856,13 @@
               <w:noProof/>
             </w:rPr>
           </w:pPr>
-          <w:hyperlink w:anchor="_Toc216769632" w:history="1">
+          <w:hyperlink w:anchor="_Toc216784267" w:history="1">
             <w:r>
               <w:rPr>
                 <w:rStyle w:val="Hyperlink"/>
                 <w:noProof/>
               </w:rPr>
-              <w:t>3. Como acessar o formulário</w:t>
+              <w:t>3. COMO ACESSAR O FORMULÁRIO</w:t>
             </w:r>
             <w:r>
               <w:rPr>
@@ -552,7 +883,7 @@
                 <w:noProof/>
                 <w:webHidden/>
               </w:rPr>
-              <w:instrText xml:space="preserve"> PAGEREF _Toc216769632 \h </w:instrText>
+              <w:instrText xml:space="preserve"> PAGEREF _Toc216784267 \h </w:instrText>
             </w:r>
             <w:r>
               <w:rPr>
@@ -593,13 +924,13 @@
               <w:noProof/>
             </w:rPr>
           </w:pPr>
-          <w:hyperlink w:anchor="_Toc216769633" w:history="1">
+          <w:hyperlink w:anchor="_Toc216784268" w:history="1">
             <w:r>
               <w:rPr>
                 <w:rStyle w:val="Hyperlink"/>
                 <w:noProof/>
               </w:rPr>
-              <w:t>4. Preenchendo a inscrição</w:t>
+              <w:t>4. PREENCHENDO A INSCRIÇÃO</w:t>
             </w:r>
             <w:r>
               <w:rPr>
@@ -620,7 +951,7 @@
                 <w:noProof/>
                 <w:webHidden/>
               </w:rPr>
-              <w:instrText xml:space="preserve"> PAGEREF _Toc216769633 \h </w:instrText>
+              <w:instrText xml:space="preserve"> PAGEREF _Toc216784268 \h </w:instrText>
             </w:r>
             <w:r>
               <w:rPr>
@@ -661,7 +992,7 @@
               <w:noProof/>
             </w:rPr>
           </w:pPr>
-          <w:hyperlink w:anchor="_Toc216769634" w:history="1">
+          <w:hyperlink w:anchor="_Toc216784269" w:history="1">
             <w:r>
               <w:rPr>
                 <w:rStyle w:val="Hyperlink"/>
@@ -688,7 +1019,7 @@
                 <w:noProof/>
                 <w:webHidden/>
               </w:rPr>
-              <w:instrText xml:space="preserve"> PAGEREF _Toc216769634 \h </w:instrText>
+              <w:instrText xml:space="preserve"> PAGEREF _Toc216784269 \h </w:instrText>
             </w:r>
             <w:r>
               <w:rPr>
@@ -729,7 +1060,7 @@
               <w:noProof/>
             </w:rPr>
           </w:pPr>
-          <w:hyperlink w:anchor="_Toc216769635" w:history="1">
+          <w:hyperlink w:anchor="_Toc216784270" w:history="1">
             <w:r>
               <w:rPr>
                 <w:rStyle w:val="Hyperlink"/>
@@ -756,7 +1087,7 @@
                 <w:noProof/>
                 <w:webHidden/>
               </w:rPr>
-              <w:instrText xml:space="preserve"> PAGEREF _Toc216769635 \h </w:instrText>
+              <w:instrText xml:space="preserve"> PAGEREF _Toc216784270 \h </w:instrText>
             </w:r>
             <w:r>
               <w:rPr>
@@ -797,13 +1128,13 @@
               <w:noProof/>
             </w:rPr>
           </w:pPr>
-          <w:hyperlink w:anchor="_Toc216769636" w:history="1">
+          <w:hyperlink w:anchor="_Toc216784271" w:history="1">
             <w:r>
               <w:rPr>
                 <w:rStyle w:val="Hyperlink"/>
                 <w:noProof/>
               </w:rPr>
-              <w:t>5. Preenchendo o Projeto de Pesquisa</w:t>
+              <w:t>5. PREENCHENDO O PROJETO DE PESQUISA</w:t>
             </w:r>
             <w:r>
               <w:rPr>
@@ -824,7 +1155,7 @@
                 <w:noProof/>
                 <w:webHidden/>
               </w:rPr>
-              <w:instrText xml:space="preserve"> PAGEREF _Toc216769636 \h </w:instrText>
+              <w:instrText xml:space="preserve"> PAGEREF _Toc216784271 \h </w:instrText>
             </w:r>
             <w:r>
               <w:rPr>
@@ -865,7 +1196,7 @@
               <w:noProof/>
             </w:rPr>
           </w:pPr>
-          <w:hyperlink w:anchor="_Toc216769637" w:history="1">
+          <w:hyperlink w:anchor="_Toc216784272" w:history="1">
             <w:r>
               <w:rPr>
                 <w:rStyle w:val="Hyperlink"/>
@@ -892,7 +1223,7 @@
                 <w:noProof/>
                 <w:webHidden/>
               </w:rPr>
-              <w:instrText xml:space="preserve"> PAGEREF _Toc216769637 \h </w:instrText>
+              <w:instrText xml:space="preserve"> PAGEREF _Toc216784272 \h </w:instrText>
             </w:r>
             <w:r>
               <w:rPr>
@@ -933,7 +1264,7 @@
               <w:noProof/>
             </w:rPr>
           </w:pPr>
-          <w:hyperlink w:anchor="_Toc216769638" w:history="1">
+          <w:hyperlink w:anchor="_Toc216784273" w:history="1">
             <w:r>
               <w:rPr>
                 <w:rStyle w:val="Hyperlink"/>
@@ -960,7 +1291,7 @@
                 <w:noProof/>
                 <w:webHidden/>
               </w:rPr>
-              <w:instrText xml:space="preserve"> PAGEREF _Toc216769638 \h </w:instrText>
+              <w:instrText xml:space="preserve"> PAGEREF _Toc216784273 \h </w:instrText>
             </w:r>
             <w:r>
               <w:rPr>
@@ -1001,7 +1332,7 @@
               <w:noProof/>
             </w:rPr>
           </w:pPr>
-          <w:hyperlink w:anchor="_Toc216769639" w:history="1">
+          <w:hyperlink w:anchor="_Toc216784274" w:history="1">
             <w:r>
               <w:rPr>
                 <w:rStyle w:val="Hyperlink"/>
@@ -1028,7 +1359,7 @@
                 <w:noProof/>
                 <w:webHidden/>
               </w:rPr>
-              <w:instrText xml:space="preserve"> PAGEREF _Toc216769639 \h </w:instrText>
+              <w:instrText xml:space="preserve"> PAGEREF _Toc216784274 \h </w:instrText>
             </w:r>
             <w:r>
               <w:rPr>
@@ -1069,13 +1400,13 @@
               <w:noProof/>
             </w:rPr>
           </w:pPr>
-          <w:hyperlink w:anchor="_Toc216769640" w:history="1">
+          <w:hyperlink w:anchor="_Toc216784275" w:history="1">
             <w:r>
               <w:rPr>
                 <w:rStyle w:val="Hyperlink"/>
                 <w:noProof/>
               </w:rPr>
-              <w:t>6. Revisar antes de enviar</w:t>
+              <w:t>6. REVISAR ANTES DE ENVIAR</w:t>
             </w:r>
             <w:r>
               <w:rPr>
@@ -1096,7 +1427,7 @@
                 <w:noProof/>
                 <w:webHidden/>
               </w:rPr>
-              <w:instrText xml:space="preserve"> PAGEREF _Toc216769640 \h </w:instrText>
+              <w:instrText xml:space="preserve"> PAGEREF _Toc216784275 \h </w:instrText>
             </w:r>
             <w:r>
               <w:rPr>
@@ -1137,13 +1468,13 @@
               <w:noProof/>
             </w:rPr>
           </w:pPr>
-          <w:hyperlink w:anchor="_Toc216769641" w:history="1">
+          <w:hyperlink w:anchor="_Toc216784276" w:history="1">
             <w:r>
               <w:rPr>
                 <w:rStyle w:val="Hyperlink"/>
                 <w:noProof/>
               </w:rPr>
-              <w:t>7. Enviar inscrição e gerar o PDF oficial</w:t>
+              <w:t>7. ENVIAR INSCRIÇÃO E GERAR O PDF OFICIAL</w:t>
             </w:r>
             <w:r>
               <w:rPr>
@@ -1164,7 +1495,7 @@
                 <w:noProof/>
                 <w:webHidden/>
               </w:rPr>
-              <w:instrText xml:space="preserve"> PAGEREF _Toc216769641 \h </w:instrText>
+              <w:instrText xml:space="preserve"> PAGEREF _Toc216784276 \h </w:instrText>
             </w:r>
             <w:r>
               <w:rPr>
@@ -1205,13 +1536,13 @@
               <w:noProof/>
             </w:rPr>
           </w:pPr>
-          <w:hyperlink w:anchor="_Toc216769642" w:history="1">
+          <w:hyperlink w:anchor="_Toc216784277" w:history="1">
             <w:r>
               <w:rPr>
                 <w:rStyle w:val="Hyperlink"/>
                 <w:noProof/>
               </w:rPr>
-              <w:t>8. Guardar e verificar a inscrição</w:t>
+              <w:t>8. GUARDAR E VERIFICAR A INSCRIÇÃO</w:t>
             </w:r>
             <w:r>
               <w:rPr>
@@ -1232,7 +1563,7 @@
                 <w:noProof/>
                 <w:webHidden/>
               </w:rPr>
-              <w:instrText xml:space="preserve"> PAGEREF _Toc216769642 \h </w:instrText>
+              <w:instrText xml:space="preserve"> PAGEREF _Toc216784277 \h </w:instrText>
             </w:r>
             <w:r>
               <w:rPr>
@@ -1252,7 +1583,7 @@
                 <w:noProof/>
                 <w:webHidden/>
               </w:rPr>
-              <w:t>10</w:t>
+              <w:t>11</w:t>
             </w:r>
             <w:r>
               <w:rPr>
@@ -1273,13 +1604,13 @@
               <w:noProof/>
             </w:rPr>
           </w:pPr>
-          <w:hyperlink w:anchor="_Toc216769643" w:history="1">
+          <w:hyperlink w:anchor="_Toc216784278" w:history="1">
             <w:r>
               <w:rPr>
                 <w:rStyle w:val="Hyperlink"/>
                 <w:noProof/>
               </w:rPr>
-              <w:t>9. Dúvidas frequentes</w:t>
+              <w:t>9. DÚVIDAS FREQUENTES</w:t>
             </w:r>
             <w:r>
               <w:rPr>
@@ -1300,7 +1631,7 @@
                 <w:noProof/>
                 <w:webHidden/>
               </w:rPr>
-              <w:instrText xml:space="preserve"> PAGEREF _Toc216769643 \h </w:instrText>
+              <w:instrText xml:space="preserve"> PAGEREF _Toc216784278 \h </w:instrText>
             </w:r>
             <w:r>
               <w:rPr>
@@ -1341,13 +1672,13 @@
               <w:noProof/>
             </w:rPr>
           </w:pPr>
-          <w:hyperlink w:anchor="_Toc216769644" w:history="1">
+          <w:hyperlink w:anchor="_Toc216784279" w:history="1">
             <w:r>
               <w:rPr>
                 <w:rStyle w:val="Hyperlink"/>
                 <w:noProof/>
               </w:rPr>
-              <w:t>10. Suporte</w:t>
+              <w:t>10. SUPORTE</w:t>
             </w:r>
             <w:r>
               <w:rPr>
@@ -1368,7 +1699,7 @@
                 <w:noProof/>
                 <w:webHidden/>
               </w:rPr>
-              <w:instrText xml:space="preserve"> PAGEREF _Toc216769644 \h </w:instrText>
+              <w:instrText xml:space="preserve"> PAGEREF _Toc216784279 \h </w:instrText>
             </w:r>
             <w:r>
               <w:rPr>
@@ -1388,7 +1719,7 @@
                 <w:noProof/>
                 <w:webHidden/>
               </w:rPr>
-              <w:t>12</w:t>
+              <w:t>13</w:t>
             </w:r>
             <w:r>
               <w:rPr>
@@ -1433,7 +1764,7 @@
     </w:p>
     <w:p>
       <w:r>
-        <w:pict w14:anchorId="37A04816">
+        <w:pict w14:anchorId="5B23831B">
           <v:rect id="_x0000_i1025" style="width:0;height:1.5pt" o:hralign="center" o:hrstd="t" o:hr="t"/>
         </w:pict>
       </w:r>
@@ -1441,111 +1772,77 @@
     <w:p>
       <w:pPr>
         <w:pStyle w:val="Ttulo2"/>
-        <w:rPr>
-          <w:szCs w:val="24"/>
-        </w:rPr>
-      </w:pPr>
-      <w:bookmarkStart w:id="2" w:name="apresentação"/>
-      <w:bookmarkStart w:id="3" w:name="_Toc216769628"/>
-      <w:r>
-        <w:rPr>
-          <w:szCs w:val="24"/>
-        </w:rPr>
+      </w:pPr>
+      <w:bookmarkStart w:id="0" w:name="apresentação"/>
+      <w:bookmarkStart w:id="1" w:name="_Toc216784263"/>
+      <w:r>
+        <w:t>1. APRESENTAÇÃO</w:t>
+      </w:r>
+      <w:bookmarkEnd w:id="1"/>
+    </w:p>
+    <w:p>
+      <w:r>
+        <w:t>Este manual explica, em linguagem simples, como o candidato realiza a inscrição no Sistema AVALIA+. Ao final do processo, o sistema gera um PDF oficial contendo o número de protocolo da inscrição e um código hash SHA-256 para verificação de autenticidade.</w:t>
+      </w:r>
+    </w:p>
+    <w:p>
+      <w:pPr>
+        <w:pStyle w:val="Ttulo2"/>
+      </w:pPr>
+      <w:bookmarkStart w:id="2" w:name="antes-de-começar"/>
+      <w:bookmarkStart w:id="3" w:name="_Toc216784264"/>
+      <w:bookmarkEnd w:id="0"/>
+      <w:r>
         <w:lastRenderedPageBreak/>
-        <w:t>1. Apresentação</w:t>
+        <w:t>2. ANTES DE COMEÇAR</w:t>
       </w:r>
       <w:bookmarkEnd w:id="3"/>
     </w:p>
     <w:p>
-      <w:r>
-        <w:t>Este manual explica, em linguagem simples, como o candidato realiza a inscrição no Sistema AVALIA+. Ao final do processo, o sistema gera um PDF oficial contendo o número de protocolo da inscrição e um código hash SHA-256 para verificação de autenticidade.</w:t>
+      <w:pPr>
+        <w:pStyle w:val="Ttulo3"/>
+      </w:pPr>
+      <w:bookmarkStart w:id="4" w:name="o-que-você-precisa"/>
+      <w:bookmarkStart w:id="5" w:name="_Toc216784265"/>
+      <w:r>
+        <w:t>2.1. O que você precisa</w:t>
+      </w:r>
+      <w:bookmarkEnd w:id="5"/>
+    </w:p>
+    <w:p>
+      <w:r>
+        <w:t>Para realizar sua inscrição, você precisará de um computador ou celular com acesso à internet e um navegador atualizado como Chrome, Edge ou Firefox. Reserve um tempo adequado para preencher o formulário com calma e atenção.</w:t>
+      </w:r>
+    </w:p>
+    <w:p>
+      <w:pPr>
+        <w:pStyle w:val="Ttulo3"/>
+      </w:pPr>
+      <w:bookmarkStart w:id="6" w:name="importante-sobre-avaliação-às-cegas"/>
+      <w:bookmarkStart w:id="7" w:name="_Toc216784266"/>
+      <w:bookmarkEnd w:id="4"/>
+      <w:r>
+        <w:t>2.2. Importante sobre avaliação às cegas</w:t>
+      </w:r>
+      <w:bookmarkEnd w:id="7"/>
+    </w:p>
+    <w:p>
+      <w:r>
+        <w:t>O anteprojeto é avaliado sem identificação dos candidatos. Por isso, não escreva CPF, e-mail, telefone ou qualquer dado pessoal no texto do projeto. Se o sistema detectar algum dado pessoal, ele impedirá o envio da inscrição.</w:t>
       </w:r>
     </w:p>
     <w:p>
       <w:pPr>
         <w:pStyle w:val="Ttulo2"/>
-        <w:rPr>
-          <w:szCs w:val="24"/>
-        </w:rPr>
-      </w:pPr>
-      <w:bookmarkStart w:id="4" w:name="antes-de-começar"/>
-      <w:bookmarkStart w:id="5" w:name="_Toc216769629"/>
+      </w:pPr>
+      <w:bookmarkStart w:id="8" w:name="como-acessar-o-formulário"/>
+      <w:bookmarkStart w:id="9" w:name="_Toc216784267"/>
       <w:bookmarkEnd w:id="2"/>
-      <w:r>
-        <w:rPr>
-          <w:szCs w:val="24"/>
-        </w:rPr>
-        <w:t>2. Antes de começar</w:t>
-      </w:r>
-      <w:bookmarkEnd w:id="5"/>
-    </w:p>
-    <w:p>
-      <w:pPr>
-        <w:pStyle w:val="Ttulo3"/>
-        <w:rPr>
-          <w:sz w:val="24"/>
-          <w:szCs w:val="24"/>
-        </w:rPr>
-      </w:pPr>
-      <w:bookmarkStart w:id="6" w:name="o-que-você-precisa"/>
-      <w:bookmarkStart w:id="7" w:name="_Toc216769630"/>
-      <w:r>
-        <w:rPr>
-          <w:sz w:val="24"/>
-          <w:szCs w:val="24"/>
-        </w:rPr>
-        <w:t>2.1. O que você precisa</w:t>
-      </w:r>
-      <w:bookmarkEnd w:id="7"/>
-    </w:p>
-    <w:p>
-      <w:r>
-        <w:t>Para realizar sua inscrição, você precisará de um computador ou celular com acesso à internet e um navegador atualizado como Chrome, Edge ou Firefox. Reserve um tempo adequado para preencher o formulário com calma e atenção.</w:t>
-      </w:r>
-    </w:p>
-    <w:p>
-      <w:pPr>
-        <w:pStyle w:val="Ttulo3"/>
-        <w:rPr>
-          <w:sz w:val="24"/>
-          <w:szCs w:val="24"/>
-        </w:rPr>
-      </w:pPr>
-      <w:bookmarkStart w:id="8" w:name="importante-sobre-avaliação-às-cegas"/>
-      <w:bookmarkStart w:id="9" w:name="_Toc216769631"/>
       <w:bookmarkEnd w:id="6"/>
       <w:r>
-        <w:rPr>
-          <w:sz w:val="24"/>
-          <w:szCs w:val="24"/>
-        </w:rPr>
-        <w:t>2.2. Importante sobre avaliação às cegas</w:t>
+        <w:t>3. COMO ACESSAR O FORMULÁRIO</w:t>
       </w:r>
       <w:bookmarkEnd w:id="9"/>
-    </w:p>
-    <w:p>
-      <w:r>
-        <w:t>O anteprojeto é avaliado sem identificação dos candidatos. Por isso, não escreva CPF, e-mail, telefone ou qualquer dado pessoal no texto do projeto. Se o sistema detectar algum dado pessoal, ele impedirá o envio da inscrição.</w:t>
-      </w:r>
-    </w:p>
-    <w:p>
-      <w:pPr>
-        <w:pStyle w:val="Ttulo2"/>
-        <w:rPr>
-          <w:szCs w:val="24"/>
-        </w:rPr>
-      </w:pPr>
-      <w:bookmarkStart w:id="10" w:name="como-acessar-o-formulário"/>
-      <w:bookmarkStart w:id="11" w:name="_Toc216769632"/>
-      <w:bookmarkEnd w:id="4"/>
-      <w:bookmarkEnd w:id="8"/>
-      <w:r>
-        <w:rPr>
-          <w:szCs w:val="24"/>
-        </w:rPr>
-        <w:t>3. Como acessar o formulário</w:t>
-      </w:r>
-      <w:bookmarkEnd w:id="11"/>
     </w:p>
     <w:p>
       <w:r>
@@ -1577,8 +1874,8 @@
         </w:rPr>
         <w:lastRenderedPageBreak/>
         <w:drawing>
-          <wp:inline distT="0" distB="0" distL="0" distR="0" wp14:anchorId="37A04817" wp14:editId="37A04818">
-            <wp:extent cx="4200525" cy="3225916"/>
+          <wp:inline distT="0" distB="0" distL="0" distR="0" wp14:anchorId="5B23831C" wp14:editId="5B23831D">
+            <wp:extent cx="4200525" cy="3840727"/>
             <wp:effectExtent l="0" t="0" r="0" b="0"/>
             <wp:docPr id="23" name="Picture"/>
             <wp:cNvGraphicFramePr/>
@@ -1592,7 +1889,7 @@
                     </pic:cNvPicPr>
                   </pic:nvPicPr>
                   <pic:blipFill>
-                    <a:blip r:embed="rId7"/>
+                    <a:blip r:embed="rId8"/>
                     <a:stretch>
                       <a:fillRect/>
                     </a:stretch>
@@ -1600,7 +1897,7 @@
                   <pic:spPr bwMode="auto">
                     <a:xfrm>
                       <a:off x="0" y="0"/>
-                      <a:ext cx="4200525" cy="3225916"/>
+                      <a:ext cx="4200525" cy="3840727"/>
                     </a:xfrm>
                     <a:prstGeom prst="rect">
                       <a:avLst/>
@@ -1622,39 +1919,25 @@
     <w:p>
       <w:pPr>
         <w:pStyle w:val="Ttulo2"/>
-        <w:rPr>
-          <w:szCs w:val="24"/>
-        </w:rPr>
-      </w:pPr>
-      <w:bookmarkStart w:id="12" w:name="preenchendo-a-inscrição"/>
-      <w:bookmarkStart w:id="13" w:name="_Toc216769633"/>
-      <w:bookmarkEnd w:id="10"/>
-      <w:r>
-        <w:rPr>
-          <w:szCs w:val="24"/>
-        </w:rPr>
-        <w:t>4. Preenchendo a inscrição</w:t>
+      </w:pPr>
+      <w:bookmarkStart w:id="10" w:name="preenchendo-a-inscrição"/>
+      <w:bookmarkStart w:id="11" w:name="_Toc216784268"/>
+      <w:bookmarkEnd w:id="8"/>
+      <w:r>
+        <w:t>4. PREENCHENDO A INSCRIÇÃO</w:t>
+      </w:r>
+      <w:bookmarkEnd w:id="11"/>
+    </w:p>
+    <w:p>
+      <w:pPr>
+        <w:pStyle w:val="Ttulo3"/>
+      </w:pPr>
+      <w:bookmarkStart w:id="12" w:name="ficha-de-inscrição"/>
+      <w:bookmarkStart w:id="13" w:name="_Toc216784269"/>
+      <w:r>
+        <w:t>4.1. Ficha de Inscrição</w:t>
       </w:r>
       <w:bookmarkEnd w:id="13"/>
-    </w:p>
-    <w:p>
-      <w:pPr>
-        <w:pStyle w:val="Ttulo3"/>
-        <w:rPr>
-          <w:sz w:val="24"/>
-          <w:szCs w:val="24"/>
-        </w:rPr>
-      </w:pPr>
-      <w:bookmarkStart w:id="14" w:name="ficha-de-inscrição"/>
-      <w:bookmarkStart w:id="15" w:name="_Toc216769634"/>
-      <w:r>
-        <w:rPr>
-          <w:sz w:val="24"/>
-          <w:szCs w:val="24"/>
-        </w:rPr>
-        <w:t>4.1. Ficha de Inscrição</w:t>
-      </w:r>
-      <w:bookmarkEnd w:id="15"/>
     </w:p>
     <w:p>
       <w:r>
@@ -1694,7 +1977,7 @@
         </w:rPr>
         <w:lastRenderedPageBreak/>
         <w:drawing>
-          <wp:inline distT="0" distB="0" distL="0" distR="0" wp14:anchorId="37A04819" wp14:editId="37A0481A">
+          <wp:inline distT="0" distB="0" distL="0" distR="0" wp14:anchorId="5B23831E" wp14:editId="5B23831F">
             <wp:extent cx="4200525" cy="3369286"/>
             <wp:effectExtent l="0" t="0" r="0" b="0"/>
             <wp:docPr id="27" name="Picture"/>
@@ -1709,7 +1992,7 @@
                     </pic:cNvPicPr>
                   </pic:nvPicPr>
                   <pic:blipFill>
-                    <a:blip r:embed="rId8"/>
+                    <a:blip r:embed="rId9"/>
                     <a:stretch>
                       <a:fillRect/>
                     </a:stretch>
@@ -1767,22 +2050,14 @@
     <w:p>
       <w:pPr>
         <w:pStyle w:val="Ttulo3"/>
-        <w:rPr>
-          <w:sz w:val="24"/>
-          <w:szCs w:val="24"/>
-        </w:rPr>
-      </w:pPr>
-      <w:bookmarkStart w:id="16" w:name="termo-de-compromisso"/>
-      <w:bookmarkStart w:id="17" w:name="_Toc216769635"/>
-      <w:bookmarkEnd w:id="14"/>
-      <w:r>
-        <w:rPr>
-          <w:sz w:val="24"/>
-          <w:szCs w:val="24"/>
-        </w:rPr>
+      </w:pPr>
+      <w:bookmarkStart w:id="14" w:name="termo-de-compromisso"/>
+      <w:bookmarkStart w:id="15" w:name="_Toc216784270"/>
+      <w:bookmarkEnd w:id="12"/>
+      <w:r>
         <w:t>4.2. Termo de Compromisso</w:t>
       </w:r>
-      <w:bookmarkEnd w:id="17"/>
+      <w:bookmarkEnd w:id="15"/>
     </w:p>
     <w:p>
       <w:r>
@@ -1814,7 +2089,7 @@
         </w:rPr>
         <w:lastRenderedPageBreak/>
         <w:drawing>
-          <wp:inline distT="0" distB="0" distL="0" distR="0" wp14:anchorId="37A0481B" wp14:editId="37A0481C">
+          <wp:inline distT="0" distB="0" distL="0" distR="0" wp14:anchorId="5B238320" wp14:editId="5B238321">
             <wp:extent cx="4200525" cy="1013791"/>
             <wp:effectExtent l="0" t="0" r="0" b="0"/>
             <wp:docPr id="31" name="Picture"/>
@@ -1829,7 +2104,7 @@
                     </pic:cNvPicPr>
                   </pic:nvPicPr>
                   <pic:blipFill>
-                    <a:blip r:embed="rId9"/>
+                    <a:blip r:embed="rId10"/>
                     <a:stretch>
                       <a:fillRect/>
                     </a:stretch>
@@ -1859,40 +2134,26 @@
     <w:p>
       <w:pPr>
         <w:pStyle w:val="Ttulo2"/>
-        <w:rPr>
-          <w:szCs w:val="24"/>
-        </w:rPr>
-      </w:pPr>
-      <w:bookmarkStart w:id="18" w:name="preenchendo-o-projeto-de-pesquisa"/>
-      <w:bookmarkStart w:id="19" w:name="_Toc216769636"/>
-      <w:bookmarkEnd w:id="12"/>
-      <w:bookmarkEnd w:id="16"/>
-      <w:r>
-        <w:rPr>
-          <w:szCs w:val="24"/>
-        </w:rPr>
-        <w:t>5. Preenchendo o Projeto de Pesquisa</w:t>
+      </w:pPr>
+      <w:bookmarkStart w:id="16" w:name="preenchendo-o-projeto-de-pesquisa"/>
+      <w:bookmarkStart w:id="17" w:name="_Toc216784271"/>
+      <w:bookmarkEnd w:id="10"/>
+      <w:bookmarkEnd w:id="14"/>
+      <w:r>
+        <w:t>5. PREENCHENDO O PROJETO DE PESQUISA</w:t>
+      </w:r>
+      <w:bookmarkEnd w:id="17"/>
+    </w:p>
+    <w:p>
+      <w:pPr>
+        <w:pStyle w:val="Ttulo3"/>
+      </w:pPr>
+      <w:bookmarkStart w:id="18" w:name="selecionar-a-área-de-pesquisa"/>
+      <w:bookmarkStart w:id="19" w:name="_Toc216784272"/>
+      <w:r>
+        <w:t>5.1. Selecionar a área de pesquisa</w:t>
       </w:r>
       <w:bookmarkEnd w:id="19"/>
-    </w:p>
-    <w:p>
-      <w:pPr>
-        <w:pStyle w:val="Ttulo3"/>
-        <w:rPr>
-          <w:sz w:val="24"/>
-          <w:szCs w:val="24"/>
-        </w:rPr>
-      </w:pPr>
-      <w:bookmarkStart w:id="20" w:name="selecionar-a-área-de-pesquisa"/>
-      <w:bookmarkStart w:id="21" w:name="_Toc216769637"/>
-      <w:r>
-        <w:rPr>
-          <w:sz w:val="24"/>
-          <w:szCs w:val="24"/>
-        </w:rPr>
-        <w:t>5.1. Selecionar a área de pesquisa</w:t>
-      </w:r>
-      <w:bookmarkEnd w:id="21"/>
     </w:p>
     <w:p>
       <w:r>
@@ -1923,7 +2184,7 @@
           <w:noProof/>
         </w:rPr>
         <w:drawing>
-          <wp:inline distT="0" distB="0" distL="0" distR="0" wp14:anchorId="37A0481D" wp14:editId="37A0481E">
+          <wp:inline distT="0" distB="0" distL="0" distR="0" wp14:anchorId="5B238322" wp14:editId="5B238323">
             <wp:extent cx="4200525" cy="1386688"/>
             <wp:effectExtent l="0" t="0" r="0" b="0"/>
             <wp:docPr id="36" name="Picture"/>
@@ -1938,7 +2199,7 @@
                     </pic:cNvPicPr>
                   </pic:nvPicPr>
                   <pic:blipFill>
-                    <a:blip r:embed="rId10"/>
+                    <a:blip r:embed="rId11"/>
                     <a:stretch>
                       <a:fillRect/>
                     </a:stretch>
@@ -1968,22 +2229,14 @@
     <w:p>
       <w:pPr>
         <w:pStyle w:val="Ttulo3"/>
-        <w:rPr>
-          <w:sz w:val="24"/>
-          <w:szCs w:val="24"/>
-        </w:rPr>
-      </w:pPr>
-      <w:bookmarkStart w:id="22" w:name="limite-de-caracteres"/>
-      <w:bookmarkStart w:id="23" w:name="_Toc216769638"/>
-      <w:bookmarkEnd w:id="20"/>
-      <w:r>
-        <w:rPr>
-          <w:sz w:val="24"/>
-          <w:szCs w:val="24"/>
-        </w:rPr>
+      </w:pPr>
+      <w:bookmarkStart w:id="20" w:name="limite-de-caracteres"/>
+      <w:bookmarkStart w:id="21" w:name="_Toc216784273"/>
+      <w:bookmarkEnd w:id="18"/>
+      <w:r>
         <w:t>5.2. Limite de caracteres</w:t>
       </w:r>
-      <w:bookmarkEnd w:id="23"/>
+      <w:bookmarkEnd w:id="21"/>
     </w:p>
     <w:p>
       <w:r>
@@ -2015,7 +2268,7 @@
           <w:noProof/>
         </w:rPr>
         <w:drawing>
-          <wp:inline distT="0" distB="0" distL="0" distR="0" wp14:anchorId="37A0481F" wp14:editId="37A04820">
+          <wp:inline distT="0" distB="0" distL="0" distR="0" wp14:anchorId="5B238324" wp14:editId="5B238325">
             <wp:extent cx="4200525" cy="3235637"/>
             <wp:effectExtent l="0" t="0" r="0" b="0"/>
             <wp:docPr id="40" name="Picture"/>
@@ -2030,7 +2283,7 @@
                     </pic:cNvPicPr>
                   </pic:nvPicPr>
                   <pic:blipFill>
-                    <a:blip r:embed="rId11"/>
+                    <a:blip r:embed="rId12"/>
                     <a:stretch>
                       <a:fillRect/>
                     </a:stretch>
@@ -2060,22 +2313,14 @@
     <w:p>
       <w:pPr>
         <w:pStyle w:val="Ttulo3"/>
-        <w:rPr>
-          <w:sz w:val="24"/>
-          <w:szCs w:val="24"/>
-        </w:rPr>
-      </w:pPr>
-      <w:bookmarkStart w:id="24" w:name="X248899db0248d46729a2b6b3f66393db043c408"/>
-      <w:bookmarkStart w:id="25" w:name="_Toc216769639"/>
-      <w:bookmarkEnd w:id="22"/>
-      <w:r>
-        <w:rPr>
-          <w:sz w:val="24"/>
-          <w:szCs w:val="24"/>
-        </w:rPr>
+      </w:pPr>
+      <w:bookmarkStart w:id="22" w:name="X248899db0248d46729a2b6b3f66393db043c408"/>
+      <w:bookmarkStart w:id="23" w:name="_Toc216784274"/>
+      <w:bookmarkEnd w:id="20"/>
+      <w:r>
         <w:t>5.3. Evitar dados pessoais (regra da avaliação às cegas)</w:t>
       </w:r>
-      <w:bookmarkEnd w:id="25"/>
+      <w:bookmarkEnd w:id="23"/>
     </w:p>
     <w:p>
       <w:r>
@@ -2225,7 +2470,7 @@
         </w:rPr>
         <w:lastRenderedPageBreak/>
         <w:drawing>
-          <wp:inline distT="0" distB="0" distL="0" distR="0" wp14:anchorId="37A04821" wp14:editId="37A04822">
+          <wp:inline distT="0" distB="0" distL="0" distR="0" wp14:anchorId="5B238326" wp14:editId="5B238327">
             <wp:extent cx="4200525" cy="3195022"/>
             <wp:effectExtent l="0" t="0" r="0" b="0"/>
             <wp:docPr id="44" name="Picture"/>
@@ -2240,7 +2485,7 @@
                     </pic:cNvPicPr>
                   </pic:nvPicPr>
                   <pic:blipFill>
-                    <a:blip r:embed="rId12"/>
+                    <a:blip r:embed="rId13"/>
                     <a:stretch>
                       <a:fillRect/>
                     </a:stretch>
@@ -2380,7 +2625,7 @@
         </w:rPr>
         <w:lastRenderedPageBreak/>
         <w:drawing>
-          <wp:inline distT="0" distB="0" distL="0" distR="0" wp14:anchorId="37A04823" wp14:editId="37A04824">
+          <wp:inline distT="0" distB="0" distL="0" distR="0" wp14:anchorId="5B238328" wp14:editId="5B238329">
             <wp:extent cx="4200525" cy="3333225"/>
             <wp:effectExtent l="0" t="0" r="0" b="0"/>
             <wp:docPr id="47" name="Picture"/>
@@ -2395,7 +2640,7 @@
                     </pic:cNvPicPr>
                   </pic:nvPicPr>
                   <pic:blipFill>
-                    <a:blip r:embed="rId13"/>
+                    <a:blip r:embed="rId14"/>
                     <a:stretch>
                       <a:fillRect/>
                     </a:stretch>
@@ -2425,21 +2670,15 @@
     <w:p>
       <w:pPr>
         <w:pStyle w:val="Ttulo2"/>
-        <w:rPr>
-          <w:szCs w:val="24"/>
-        </w:rPr>
-      </w:pPr>
-      <w:bookmarkStart w:id="26" w:name="revisar-antes-de-enviar"/>
-      <w:bookmarkStart w:id="27" w:name="_Toc216769640"/>
-      <w:bookmarkEnd w:id="18"/>
-      <w:bookmarkEnd w:id="24"/>
-      <w:r>
-        <w:rPr>
-          <w:szCs w:val="24"/>
-        </w:rPr>
-        <w:t>6. Revisar antes de enviar</w:t>
-      </w:r>
-      <w:bookmarkEnd w:id="27"/>
+      </w:pPr>
+      <w:bookmarkStart w:id="24" w:name="revisar-antes-de-enviar"/>
+      <w:bookmarkStart w:id="25" w:name="_Toc216784275"/>
+      <w:bookmarkEnd w:id="16"/>
+      <w:bookmarkEnd w:id="22"/>
+      <w:r>
+        <w:t>6. REVISAR ANTES DE ENVIAR</w:t>
+      </w:r>
+      <w:bookmarkEnd w:id="25"/>
     </w:p>
     <w:p>
       <w:r>
@@ -2470,7 +2709,7 @@
           <w:noProof/>
         </w:rPr>
         <w:drawing>
-          <wp:inline distT="0" distB="0" distL="0" distR="0" wp14:anchorId="37A04825" wp14:editId="37A04826">
+          <wp:inline distT="0" distB="0" distL="0" distR="0" wp14:anchorId="5B23832A" wp14:editId="5B23832B">
             <wp:extent cx="4200525" cy="473000"/>
             <wp:effectExtent l="0" t="0" r="0" b="0"/>
             <wp:docPr id="52" name="Picture"/>
@@ -2485,7 +2724,7 @@
                     </pic:cNvPicPr>
                   </pic:nvPicPr>
                   <pic:blipFill>
-                    <a:blip r:embed="rId14"/>
+                    <a:blip r:embed="rId15"/>
                     <a:stretch>
                       <a:fillRect/>
                     </a:stretch>
@@ -2545,7 +2784,7 @@
         </w:rPr>
         <w:lastRenderedPageBreak/>
         <w:drawing>
-          <wp:inline distT="0" distB="0" distL="0" distR="0" wp14:anchorId="37A04827" wp14:editId="37A04828">
+          <wp:inline distT="0" distB="0" distL="0" distR="0" wp14:anchorId="5B23832C" wp14:editId="5B23832D">
             <wp:extent cx="4200525" cy="3896701"/>
             <wp:effectExtent l="0" t="0" r="0" b="0"/>
             <wp:docPr id="55" name="Picture"/>
@@ -2560,7 +2799,7 @@
                     </pic:cNvPicPr>
                   </pic:nvPicPr>
                   <pic:blipFill>
-                    <a:blip r:embed="rId15"/>
+                    <a:blip r:embed="rId16"/>
                     <a:stretch>
                       <a:fillRect/>
                     </a:stretch>
@@ -2598,20 +2837,14 @@
     <w:p>
       <w:pPr>
         <w:pStyle w:val="Ttulo2"/>
-        <w:rPr>
-          <w:szCs w:val="24"/>
-        </w:rPr>
-      </w:pPr>
-      <w:bookmarkStart w:id="28" w:name="enviar-inscrição-e-gerar-o-pdf-oficial"/>
-      <w:bookmarkStart w:id="29" w:name="_Toc216769641"/>
-      <w:bookmarkEnd w:id="26"/>
-      <w:r>
-        <w:rPr>
-          <w:szCs w:val="24"/>
-        </w:rPr>
-        <w:t>7. Enviar inscrição e gerar o PDF oficial</w:t>
-      </w:r>
-      <w:bookmarkEnd w:id="29"/>
+      </w:pPr>
+      <w:bookmarkStart w:id="26" w:name="enviar-inscrição-e-gerar-o-pdf-oficial"/>
+      <w:bookmarkStart w:id="27" w:name="_Toc216784276"/>
+      <w:bookmarkEnd w:id="24"/>
+      <w:r>
+        <w:t>7. ENVIAR INSCRIÇÃO E GERAR O PDF OFICIAL</w:t>
+      </w:r>
+      <w:bookmarkEnd w:id="27"/>
     </w:p>
     <w:p>
       <w:r>
@@ -2642,7 +2875,7 @@
           <w:noProof/>
         </w:rPr>
         <w:drawing>
-          <wp:inline distT="0" distB="0" distL="0" distR="0" wp14:anchorId="37A04829" wp14:editId="37A0482A">
+          <wp:inline distT="0" distB="0" distL="0" distR="0" wp14:anchorId="5B23832E" wp14:editId="5B23832F">
             <wp:extent cx="4200525" cy="473000"/>
             <wp:effectExtent l="0" t="0" r="0" b="0"/>
             <wp:docPr id="58" name="Picture"/>
@@ -2657,7 +2890,7 @@
                     </pic:cNvPicPr>
                   </pic:nvPicPr>
                   <pic:blipFill>
-                    <a:blip r:embed="rId14"/>
+                    <a:blip r:embed="rId15"/>
                     <a:stretch>
                       <a:fillRect/>
                     </a:stretch>
@@ -2717,7 +2950,7 @@
         </w:rPr>
         <w:lastRenderedPageBreak/>
         <w:drawing>
-          <wp:inline distT="0" distB="0" distL="0" distR="0" wp14:anchorId="37A0482B" wp14:editId="37A0482C">
+          <wp:inline distT="0" distB="0" distL="0" distR="0" wp14:anchorId="5B238330" wp14:editId="5B238331">
             <wp:extent cx="4200525" cy="2089031"/>
             <wp:effectExtent l="0" t="0" r="0" b="0"/>
             <wp:docPr id="61" name="Picture"/>
@@ -2732,7 +2965,7 @@
                     </pic:cNvPicPr>
                   </pic:nvPicPr>
                   <pic:blipFill>
-                    <a:blip r:embed="rId16"/>
+                    <a:blip r:embed="rId17"/>
                     <a:stretch>
                       <a:fillRect/>
                     </a:stretch>
@@ -2791,7 +3024,7 @@
           <w:noProof/>
         </w:rPr>
         <w:drawing>
-          <wp:inline distT="0" distB="0" distL="0" distR="0" wp14:anchorId="37A0482D" wp14:editId="37A0482E">
+          <wp:inline distT="0" distB="0" distL="0" distR="0" wp14:anchorId="5B238332" wp14:editId="5B238333">
             <wp:extent cx="4200525" cy="1778924"/>
             <wp:effectExtent l="0" t="0" r="0" b="0"/>
             <wp:docPr id="64" name="Picture"/>
@@ -2806,7 +3039,7 @@
                     </pic:cNvPicPr>
                   </pic:nvPicPr>
                   <pic:blipFill>
-                    <a:blip r:embed="rId17"/>
+                    <a:blip r:embed="rId18"/>
                     <a:stretch>
                       <a:fillRect/>
                     </a:stretch>
@@ -2835,25 +3068,10 @@
     </w:p>
     <w:p>
       <w:pPr>
-        <w:pStyle w:val="Ttulo2"/>
-        <w:rPr>
-          <w:szCs w:val="24"/>
-        </w:rPr>
-      </w:pPr>
-      <w:bookmarkStart w:id="30" w:name="guardar-e-verificar-a-inscrição"/>
-      <w:bookmarkStart w:id="31" w:name="_Toc216769642"/>
-      <w:bookmarkEnd w:id="28"/>
-      <w:r>
-        <w:rPr>
-          <w:szCs w:val="24"/>
-        </w:rPr>
-        <w:t>8. Guardar e verificar a inscrição</w:t>
-      </w:r>
-      <w:bookmarkEnd w:id="31"/>
-    </w:p>
-    <w:p>
-      <w:r>
-        <w:t>Guarde o PDF oficial gerado e anote o número do protocolo em local seguro. Se a coordenação solicitar, é possível verificar a autenticidade da inscrição pelo protocolo. Encontre o número do protocolo no PDF conforme mostrado abaixo.</w:t>
+        <w:pStyle w:val="Corpodetexto"/>
+      </w:pPr>
+      <w:r>
+        <w:t>A ficha oficial contém três seções: seus dados pessoais, o projeto de pesquisa completo e as informações de registro. Verifique se todas as informações estão corretas. No rodapé da ficha você encontrará o protocolo, que é o número único da sua inscrição no formato 2025-PLANTERR-XXXXX, e o hash SHA-256, um código criptográfico que garante a autenticidade do documento. A figura abaixo mostra o cabeçalho da ficha oficial.</w:t>
       </w:r>
     </w:p>
     <w:p>
@@ -2868,7 +3086,35 @@
         <w:t>Figura 18</w:t>
       </w:r>
       <w:r>
-        <w:t xml:space="preserve"> — PDF: Protocolo destacado</w:t>
+        <w:t xml:space="preserve"> — Cabeçalho da ficha oficial de inscrição</w:t>
+      </w:r>
+    </w:p>
+    <w:p>
+      <w:pPr>
+        <w:pStyle w:val="Corpodetexto"/>
+      </w:pPr>
+    </w:p>
+    <w:p>
+      <w:pPr>
+        <w:pStyle w:val="Corpodetexto"/>
+      </w:pPr>
+      <w:r>
+        <w:t>No canto superior direito da ficha há um código QR que permite validar rapidamente a autenticidade da sua inscrição. Para usar o QR Code, abra o aplicativo de câmera do seu celular, aponte para o código e toque no link que aparecer. Você será direcionado à página de verificação com seu protocolo já preenchido. O QR Code é especialmente útil para comissões avaliadoras e coordenação que precisam verificar rapidamente a autenticidade de múltiplas inscrições. A figura abaixo mostra a localização do QR Code no canto superior direito da ficha oficial.</w:t>
+      </w:r>
+    </w:p>
+    <w:p>
+      <w:pPr>
+        <w:pStyle w:val="Corpodetexto"/>
+      </w:pPr>
+      <w:r>
+        <w:rPr>
+          <w:b/>
+          <w:bCs/>
+        </w:rPr>
+        <w:t>Figura 19</w:t>
+      </w:r>
+      <w:r>
+        <w:t xml:space="preserve"> — QR Code no canto superior direito da ficha oficial</w:t>
       </w:r>
     </w:p>
     <w:p>
@@ -2879,24 +3125,23 @@
         <w:rPr>
           <w:noProof/>
         </w:rPr>
-        <w:lastRenderedPageBreak/>
         <w:drawing>
-          <wp:inline distT="0" distB="0" distL="0" distR="0" wp14:anchorId="37A0482F" wp14:editId="37A04830">
-            <wp:extent cx="4200525" cy="1589187"/>
+          <wp:inline distT="0" distB="0" distL="0" distR="0" wp14:anchorId="5B238334" wp14:editId="5B238335">
+            <wp:extent cx="4200525" cy="1495870"/>
             <wp:effectExtent l="0" t="0" r="0" b="0"/>
-            <wp:docPr id="68" name="Picture"/>
+            <wp:docPr id="67" name="Picture"/>
             <wp:cNvGraphicFramePr/>
             <a:graphic xmlns:a="http://schemas.openxmlformats.org/drawingml/2006/main">
               <a:graphicData uri="http://schemas.openxmlformats.org/drawingml/2006/picture">
                 <pic:pic xmlns:pic="http://schemas.openxmlformats.org/drawingml/2006/picture">
                   <pic:nvPicPr>
-                    <pic:cNvPr id="69" name="Picture" descr="../../prints/manual/fig-18-pdf-protocolo-destaque.jpg"/>
+                    <pic:cNvPr id="68" name="Picture" descr="../../prints/manual/fig-53-qrcode_pdf+ficha.png"/>
                     <pic:cNvPicPr>
                       <a:picLocks noChangeAspect="1" noChangeArrowheads="1"/>
                     </pic:cNvPicPr>
                   </pic:nvPicPr>
                   <pic:blipFill>
-                    <a:blip r:embed="rId18"/>
+                    <a:blip r:embed="rId19"/>
                     <a:stretch>
                       <a:fillRect/>
                     </a:stretch>
@@ -2904,7 +3149,7 @@
                   <pic:spPr bwMode="auto">
                     <a:xfrm>
                       <a:off x="0" y="0"/>
-                      <a:ext cx="4200525" cy="1589187"/>
+                      <a:ext cx="4200525" cy="1495870"/>
                     </a:xfrm>
                     <a:prstGeom prst="rect">
                       <a:avLst/>
@@ -2925,10 +3170,19 @@
     </w:p>
     <w:p>
       <w:pPr>
-        <w:pStyle w:val="Corpodetexto"/>
-      </w:pPr>
-      <w:r>
-        <w:t>Para verificar, abra o navegador e acesse a página de verificação no mesmo domínio do sistema de inscrição.</w:t>
+        <w:pStyle w:val="Ttulo2"/>
+      </w:pPr>
+      <w:bookmarkStart w:id="28" w:name="guardar-e-verificar-a-inscrição"/>
+      <w:bookmarkStart w:id="29" w:name="_Toc216784277"/>
+      <w:bookmarkEnd w:id="26"/>
+      <w:r>
+        <w:t>8. GUARDAR E VERIFICAR A INSCRIÇÃO</w:t>
+      </w:r>
+      <w:bookmarkEnd w:id="29"/>
+    </w:p>
+    <w:p>
+      <w:r>
+        <w:t>Guarde o PDF oficial gerado e anote o número do protocolo em local seguro. Se a coordenação solicitar, é possível verificar a autenticidade da inscrição pelo protocolo. Encontre o número do protocolo no PDF conforme mostrado abaixo.</w:t>
       </w:r>
     </w:p>
     <w:p>
@@ -2940,10 +3194,10 @@
           <w:b/>
           <w:bCs/>
         </w:rPr>
-        <w:t>Figura 19</w:t>
-      </w:r>
-      <w:r>
-        <w:t xml:space="preserve"> — Página de Verificação do Protocolo”</w:t>
+        <w:t>Figura 120</w:t>
+      </w:r>
+      <w:r>
+        <w:t xml:space="preserve"> — PDF: Protocolo destacado</w:t>
       </w:r>
     </w:p>
     <w:p>
@@ -2955,8 +3209,8 @@
           <w:noProof/>
         </w:rPr>
         <w:drawing>
-          <wp:inline distT="0" distB="0" distL="0" distR="0" wp14:anchorId="37A04831" wp14:editId="37A04832">
-            <wp:extent cx="4200525" cy="2440603"/>
+          <wp:inline distT="0" distB="0" distL="0" distR="0" wp14:anchorId="5B238336" wp14:editId="5B238337">
+            <wp:extent cx="4200525" cy="1739966"/>
             <wp:effectExtent l="0" t="0" r="0" b="0"/>
             <wp:docPr id="71" name="Picture"/>
             <wp:cNvGraphicFramePr/>
@@ -2964,13 +3218,13 @@
               <a:graphicData uri="http://schemas.openxmlformats.org/drawingml/2006/picture">
                 <pic:pic xmlns:pic="http://schemas.openxmlformats.org/drawingml/2006/picture">
                   <pic:nvPicPr>
-                    <pic:cNvPr id="72" name="Picture" descr="../../prints/manual/fig-19-url-verify-protocolo.png"/>
+                    <pic:cNvPr id="72" name="Picture" descr="../../prints/manual/fig-18-pdf-protocolo-destaque.png"/>
                     <pic:cNvPicPr>
                       <a:picLocks noChangeAspect="1" noChangeArrowheads="1"/>
                     </pic:cNvPicPr>
                   </pic:nvPicPr>
                   <pic:blipFill>
-                    <a:blip r:embed="rId19"/>
+                    <a:blip r:embed="rId20"/>
                     <a:stretch>
                       <a:fillRect/>
                     </a:stretch>
@@ -2978,7 +3232,7 @@
                   <pic:spPr bwMode="auto">
                     <a:xfrm>
                       <a:off x="0" y="0"/>
-                      <a:ext cx="4200525" cy="2440603"/>
+                      <a:ext cx="4200525" cy="1739966"/>
                     </a:xfrm>
                     <a:prstGeom prst="rect">
                       <a:avLst/>
@@ -3002,15 +3256,8 @@
         <w:pStyle w:val="Corpodetexto"/>
       </w:pPr>
       <w:r>
-        <w:t xml:space="preserve">Se a inscrição estiver correta, aparecerá a inscrição foi encontrada e é </w:t>
-      </w:r>
-      <w:proofErr w:type="gramStart"/>
-      <w:r>
-        <w:t>autentica</w:t>
-      </w:r>
-      <w:proofErr w:type="gramEnd"/>
-      <w:r>
-        <w:t>.</w:t>
+        <w:lastRenderedPageBreak/>
+        <w:t>Para verificar, abra o navegador e acesse a página de verificação no mesmo domínio do sistema de inscrição.</w:t>
       </w:r>
     </w:p>
     <w:p>
@@ -3022,10 +3269,10 @@
           <w:b/>
           <w:bCs/>
         </w:rPr>
-        <w:t>Figura 20</w:t>
-      </w:r>
-      <w:r>
-        <w:t xml:space="preserve"> — Verificação do Protocolo: resultado</w:t>
+        <w:t>Figura 21</w:t>
+      </w:r>
+      <w:r>
+        <w:t xml:space="preserve"> — Página de Verificação do Protocolo”</w:t>
       </w:r>
     </w:p>
     <w:p>
@@ -3036,10 +3283,9 @@
         <w:rPr>
           <w:noProof/>
         </w:rPr>
-        <w:lastRenderedPageBreak/>
         <w:drawing>
-          <wp:inline distT="0" distB="0" distL="0" distR="0" wp14:anchorId="37A04833" wp14:editId="37A04834">
-            <wp:extent cx="4200525" cy="3208564"/>
+          <wp:inline distT="0" distB="0" distL="0" distR="0" wp14:anchorId="5B238338" wp14:editId="5B238339">
+            <wp:extent cx="4200525" cy="1739966"/>
             <wp:effectExtent l="0" t="0" r="0" b="0"/>
             <wp:docPr id="74" name="Picture"/>
             <wp:cNvGraphicFramePr/>
@@ -3047,13 +3293,87 @@
               <a:graphicData uri="http://schemas.openxmlformats.org/drawingml/2006/picture">
                 <pic:pic xmlns:pic="http://schemas.openxmlformats.org/drawingml/2006/picture">
                   <pic:nvPicPr>
-                    <pic:cNvPr id="75" name="Picture" descr="../../prints/manual/fig-20-json-verify-valid-true.png"/>
+                    <pic:cNvPr id="75" name="Picture" descr="../../prints/manual/fig-19-url-verify-protocolo.png"/>
                     <pic:cNvPicPr>
                       <a:picLocks noChangeAspect="1" noChangeArrowheads="1"/>
                     </pic:cNvPicPr>
                   </pic:nvPicPr>
                   <pic:blipFill>
                     <a:blip r:embed="rId20"/>
+                    <a:stretch>
+                      <a:fillRect/>
+                    </a:stretch>
+                  </pic:blipFill>
+                  <pic:spPr bwMode="auto">
+                    <a:xfrm>
+                      <a:off x="0" y="0"/>
+                      <a:ext cx="4200525" cy="1739966"/>
+                    </a:xfrm>
+                    <a:prstGeom prst="rect">
+                      <a:avLst/>
+                    </a:prstGeom>
+                    <a:noFill/>
+                    <a:ln w="9525">
+                      <a:noFill/>
+                      <a:headEnd/>
+                      <a:tailEnd/>
+                    </a:ln>
+                  </pic:spPr>
+                </pic:pic>
+              </a:graphicData>
+            </a:graphic>
+          </wp:inline>
+        </w:drawing>
+      </w:r>
+    </w:p>
+    <w:p>
+      <w:pPr>
+        <w:pStyle w:val="Corpodetexto"/>
+      </w:pPr>
+      <w:r>
+        <w:t>Se a inscrição estiver correta, aparecerá a inscrição foi encontrada e é autentica.</w:t>
+      </w:r>
+    </w:p>
+    <w:p>
+      <w:pPr>
+        <w:pStyle w:val="Corpodetexto"/>
+      </w:pPr>
+      <w:r>
+        <w:rPr>
+          <w:b/>
+          <w:bCs/>
+        </w:rPr>
+        <w:t>Figura 22</w:t>
+      </w:r>
+      <w:r>
+        <w:t xml:space="preserve"> — Verificação do Protocolo: resultado</w:t>
+      </w:r>
+    </w:p>
+    <w:p>
+      <w:pPr>
+        <w:pStyle w:val="Corpodetexto"/>
+      </w:pPr>
+      <w:r>
+        <w:rPr>
+          <w:noProof/>
+        </w:rPr>
+        <w:drawing>
+          <wp:inline distT="0" distB="0" distL="0" distR="0" wp14:anchorId="5B23833A" wp14:editId="5B23833B">
+            <wp:extent cx="4200525" cy="3208564"/>
+            <wp:effectExtent l="0" t="0" r="0" b="0"/>
+            <wp:docPr id="77" name="Picture"/>
+            <wp:cNvGraphicFramePr/>
+            <a:graphic xmlns:a="http://schemas.openxmlformats.org/drawingml/2006/main">
+              <a:graphicData uri="http://schemas.openxmlformats.org/drawingml/2006/picture">
+                <pic:pic xmlns:pic="http://schemas.openxmlformats.org/drawingml/2006/picture">
+                  <pic:nvPicPr>
+                    <pic:cNvPr id="78" name="Picture" descr="../../prints/manual/fig-20-json-verify-valid-true.png"/>
+                    <pic:cNvPicPr>
+                      <a:picLocks noChangeAspect="1" noChangeArrowheads="1"/>
+                    </pic:cNvPicPr>
+                  </pic:nvPicPr>
+                  <pic:blipFill>
+                    <a:blip r:embed="rId21"/>
                     <a:stretch>
                       <a:fillRect/>
                     </a:stretch>
@@ -3083,55 +3403,49 @@
     <w:p>
       <w:pPr>
         <w:pStyle w:val="Ttulo2"/>
-        <w:rPr>
-          <w:szCs w:val="24"/>
-        </w:rPr>
-      </w:pPr>
-      <w:bookmarkStart w:id="32" w:name="dúvidas-frequentes"/>
-      <w:bookmarkStart w:id="33" w:name="_Toc216769643"/>
+      </w:pPr>
+      <w:bookmarkStart w:id="30" w:name="dúvidas-frequentes"/>
+      <w:bookmarkStart w:id="31" w:name="_Toc216784278"/>
+      <w:bookmarkEnd w:id="28"/>
+      <w:r>
+        <w:t>9. DÚVIDAS FREQUENTES</w:t>
+      </w:r>
+      <w:bookmarkEnd w:id="31"/>
+    </w:p>
+    <w:p>
+      <w:r>
+        <w:t xml:space="preserve">Se não conseguir gerar o PDF, verifique se o CPF é válido, se marcou o termo de compromisso e se não há alertas de avaliação às cegas indicando dados pessoais no texto. Não é </w:t>
+      </w:r>
+      <w:r>
+        <w:lastRenderedPageBreak/>
+        <w:t>possível enviar duas inscrições com o mesmo CPF, pois o sistema bloqueia duplicidade.</w:t>
+      </w:r>
+    </w:p>
+    <w:p>
+      <w:pPr>
+        <w:pStyle w:val="Ttulo2"/>
+      </w:pPr>
+      <w:bookmarkStart w:id="32" w:name="suporte"/>
+      <w:bookmarkStart w:id="33" w:name="_Toc216784279"/>
       <w:bookmarkEnd w:id="30"/>
       <w:r>
-        <w:rPr>
-          <w:szCs w:val="24"/>
-        </w:rPr>
-        <w:t>9. Dúvidas frequentes</w:t>
+        <w:t>10. SUPORTE</w:t>
       </w:r>
       <w:bookmarkEnd w:id="33"/>
     </w:p>
     <w:p>
       <w:r>
-        <w:t>Se não conseguir gerar o PDF, verifique se o CPF é válido, se marcou o termo de compromisso e se não há alertas de avaliação às cegas indicando dados pessoais no texto. Não é possível enviar duas inscrições com o mesmo CPF, pois o sistema bloqueia duplicidade.</w:t>
-      </w:r>
-    </w:p>
-    <w:p>
-      <w:pPr>
-        <w:pStyle w:val="Ttulo2"/>
-        <w:rPr>
-          <w:szCs w:val="24"/>
-        </w:rPr>
-      </w:pPr>
-      <w:bookmarkStart w:id="34" w:name="suporte"/>
-      <w:bookmarkStart w:id="35" w:name="_Toc216769644"/>
+        <w:t>Em caso de erro que impeça o envio da inscrição, informe à coordenação seu nome completo e descreva o que aconteceu. Se possível, envie uma captura de tela mostrando o erro.</w:t>
+      </w:r>
       <w:bookmarkEnd w:id="32"/>
-      <w:r>
-        <w:rPr>
-          <w:szCs w:val="24"/>
-        </w:rPr>
-        <w:t>10. Suporte</w:t>
-      </w:r>
-      <w:bookmarkEnd w:id="35"/>
-    </w:p>
-    <w:p>
-      <w:r>
-        <w:t>Em caso de erro que impeça o envio da inscrição, informe à coordenação seu nome completo e descreva o que aconteceu. Se possível, envie uma captura de tela mostrando o erro.</w:t>
-      </w:r>
-      <w:bookmarkEnd w:id="34"/>
     </w:p>
     <w:sectPr>
-      <w:headerReference w:type="default" r:id="rId21"/>
+      <w:headerReference w:type="default" r:id="rId22"/>
       <w:pgSz w:w="12240" w:h="15840"/>
       <w:pgMar w:top="1417" w:right="1701" w:bottom="1417" w:left="1701" w:header="720" w:footer="720" w:gutter="0"/>
       <w:cols w:space="720"/>
+      <w:titlePg/>
+      <w:docGrid w:linePitch="326"/>
     </w:sectPr>
   </w:body>
 </w:document>
@@ -3204,7 +3518,7 @@
         <w:noProof/>
       </w:rPr>
       <w:drawing>
-        <wp:anchor distT="0" distB="0" distL="114300" distR="114300" simplePos="0" relativeHeight="251660288" behindDoc="1" locked="0" layoutInCell="1" allowOverlap="1" wp14:anchorId="37A04838" wp14:editId="37A04839">
+        <wp:anchor distT="0" distB="0" distL="114300" distR="114300" simplePos="0" relativeHeight="251660288" behindDoc="1" locked="0" layoutInCell="1" allowOverlap="1" wp14:anchorId="5B23833F" wp14:editId="5B238340">
           <wp:simplePos x="0" y="0"/>
           <wp:positionH relativeFrom="column">
             <wp:posOffset>5073015</wp:posOffset>
@@ -3282,7 +3596,7 @@
         <w:noProof/>
       </w:rPr>
       <w:drawing>
-        <wp:anchor distT="0" distB="0" distL="114300" distR="114300" simplePos="0" relativeHeight="251658240" behindDoc="1" locked="0" layoutInCell="1" allowOverlap="1" wp14:anchorId="37A0483A" wp14:editId="37A0483B">
+        <wp:anchor distT="0" distB="0" distL="114300" distR="114300" simplePos="0" relativeHeight="251658240" behindDoc="1" locked="0" layoutInCell="1" allowOverlap="1" wp14:anchorId="5B238341" wp14:editId="5B238342">
           <wp:simplePos x="0" y="0"/>
           <wp:positionH relativeFrom="column">
             <wp:posOffset>-651510</wp:posOffset>
@@ -3474,7 +3788,7 @@
   <w:abstractNum w:abstractNumId="1" w15:restartNumberingAfterBreak="0">
     <w:nsid w:val="0000A991"/>
     <w:multiLevelType w:val="multilevel"/>
-    <w:tmpl w:val="25081C7C"/>
+    <w:tmpl w:val="6C3CC464"/>
     <w:lvl w:ilvl="0">
       <w:numFmt w:val="bullet"/>
       <w:lvlText w:val=""/>
@@ -6314,13 +6628,13 @@
   <w:num w:numId="23" w16cid:durableId="1462189685">
     <w:abstractNumId w:val="0"/>
   </w:num>
-  <w:num w:numId="24" w16cid:durableId="360058788">
+  <w:num w:numId="24" w16cid:durableId="371080777">
     <w:abstractNumId w:val="0"/>
   </w:num>
-  <w:num w:numId="25" w16cid:durableId="402721933">
+  <w:num w:numId="25" w16cid:durableId="366027506">
     <w:abstractNumId w:val="1"/>
   </w:num>
-  <w:num w:numId="26" w16cid:durableId="1309356009">
+  <w:num w:numId="26" w16cid:durableId="1883135298">
     <w:abstractNumId w:val="1"/>
   </w:num>
 </w:numbering>
@@ -8116,7 +8430,7 @@
     <w:autoRedefine/>
     <w:uiPriority w:val="39"/>
     <w:unhideWhenUsed/>
-    <w:rsid w:val="00DC66BF"/>
+    <w:rsid w:val="006B5FA8"/>
     <w:pPr>
       <w:spacing w:after="100"/>
     </w:pPr>
@@ -8128,7 +8442,7 @@
     <w:autoRedefine/>
     <w:uiPriority w:val="39"/>
     <w:unhideWhenUsed/>
-    <w:rsid w:val="00DC66BF"/>
+    <w:rsid w:val="006B5FA8"/>
     <w:pPr>
       <w:spacing w:after="100"/>
       <w:ind w:left="240"/>
@@ -8141,7 +8455,7 @@
     <w:autoRedefine/>
     <w:uiPriority w:val="39"/>
     <w:unhideWhenUsed/>
-    <w:rsid w:val="00DC66BF"/>
+    <w:rsid w:val="006B5FA8"/>
     <w:pPr>
       <w:spacing w:after="100"/>
       <w:ind w:left="480"/>

</xml_diff>